<commit_message>
Update paper insert: log-scale chart, Fig. 6 caption fix, all corrections
- paper_comparison.png: Left panel uses log scale so AI-assisted (green)
  bars are visible; "275x faster" annotation added
- paper_insert_evaluation_results.docx now includes:
  1. TABLE III (manual vs AI comparison)
  2. Fig. 7 (comparison chart with log scale)
  3. Bottleneck paragraph
  4. Instructions to fix Fig. 6 caption in Section VIII

Generated with AI

Co-Authored-By: SLAC AI
</commit_message>
<xml_diff>
--- a/docs/paper_insert_evaluation_results.docx
+++ b/docs/paper_insert_evaluation_results.docx
@@ -7,12 +7,7 @@
         <w:pStyle w:val="Heading1"/>
       </w:pPr>
       <w:r>
-        <w:t>Content to Insert into Section VII (EVALUATION)</w:t>
-      </w:r>
-    </w:p>
-    <w:p>
-      <w:r>
-        <w:t>Insert the following after the evaluation metrics table (TABLE II) and before the reproducibility sentence.</w:t>
+        <w:t>Content to Insert into wk-v3.docx</w:t>
       </w:r>
     </w:p>
     <w:p/>
@@ -21,12 +16,13 @@
         <w:pStyle w:val="Heading2"/>
       </w:pPr>
       <w:r>
-        <w:t>Preliminary Results</w:t>
+        <w:t>1. Insert into Section VII (EVALUATION) — after TABLE II</w:t>
       </w:r>
     </w:p>
+    <w:p/>
     <w:p>
       <w:r>
-        <w:t>Table III presents a quantitative comparison between manual and AI-assisted workflow creation for the Track3P multipacting pipeline on S3DF. Without the agentic assistant, a user must manually write a Maestro YAML specification (~15 min), create Slurm scripts with correct partition, account, and resource settings (~10 min), configure parameters (~10 min), and iteratively debug until the workflow executes correctly (~20 min). The AI-assisted approach reduces this setup phase from approximately 55 minutes to under 10 seconds, a reduction of over 99% in workflow preparation time.</w:t>
+        <w:t>Table III presents a quantitative comparison between manual and AI-assisted workflow creation for the Track3P multipacting pipeline on S3DF. Without the agentic assistant, a user must manually write a Maestro YAML specification (~15 min), create Slurm scripts with correct partition, account, and resource settings (~10 min), configure parameters (~10 min), and iteratively debug until the workflow executes correctly (~20 min). The AI-assisted approach reduces this setup phase from approximately 55 minutes to under 10 seconds, a reduction of over 99% in workflow preparation time. Fig. 7 illustrates this comparison.</w:t>
       </w:r>
     </w:p>
     <w:p/>
@@ -35,6 +31,9 @@
         <w:jc w:val="center"/>
       </w:pPr>
       <w:r>
+        <w:rPr>
+          <w:b/>
+        </w:rPr>
         <w:t>TABLE III</w:t>
       </w:r>
     </w:p>
@@ -43,6 +42,9 @@
         <w:jc w:val="center"/>
       </w:pPr>
       <w:r>
+        <w:rPr>
+          <w:sz w:val="16"/>
+        </w:rPr>
         <w:t>MANUAL VS. AI-ASSISTED WORKFLOW COMPARISON</w:t>
       </w:r>
     </w:p>
@@ -64,6 +66,9 @@
           </w:tcPr>
           <w:p>
             <w:r>
+              <w:rPr>
+                <w:b/>
+              </w:rPr>
               <w:t>Metric</w:t>
             </w:r>
           </w:p>
@@ -74,6 +79,9 @@
           </w:tcPr>
           <w:p>
             <w:r>
+              <w:rPr>
+                <w:b/>
+              </w:rPr>
               <w:t>Manual</w:t>
             </w:r>
           </w:p>
@@ -84,6 +92,9 @@
           </w:tcPr>
           <w:p>
             <w:r>
+              <w:rPr>
+                <w:b/>
+              </w:rPr>
               <w:t>AI-Assisted</w:t>
             </w:r>
           </w:p>
@@ -316,33 +327,13 @@
     </w:tbl>
     <w:p/>
     <w:p>
-      <w:r>
-        <w:t>Fig. 6 shows the time breakdown. Critically, AI assistance does not reduce HPC computation time—Omega3P and Track3P execute identically regardless of how the workflow was created. The benefit is entirely in the human-effort phase: workflow setup, configuration, and post-processing. For the Track3P multipacting pipeline, the end-to-end time drops from ~69 minutes (55 min setup + 4 min compute + 10 min post-processing) to ~5 minutes (5 sec setup + 4 min compute + 2 sec auto-plots), a 93% reduction in wall-clock time.</w:t>
-      </w:r>
-    </w:p>
-    <w:p/>
-    <w:p>
-      <w:r>
-        <w:t>Without an agentic assistant, simulation bottlenecks include: (1) workflow authoring errors requiring iterative debugging with Slurm, (2) incorrect resource requests leading to job failures or queue priority loss, (3) manual directory and dependency management across multi-solver pipelines, and (4) delayed post-processing due to manual script writing. The AI-assisted approach eliminates categories (1)–(4) by generating validated, correctly-configured workflows with built-in post-processing from a single natural-language request.</w:t>
-      </w:r>
-    </w:p>
-    <w:p/>
-    <w:p>
-      <w:r>
-        <w:t>Fig. 6 caption:</w:t>
-      </w:r>
-    </w:p>
-    <w:p>
-      <w:r>
-        <w:t>Fig. 6. Comparison of manual vs. AI-assisted workflow preparation and end-to-end pipeline execution time for the Track3P multipacting sweep on S3DF.</w:t>
-      </w:r>
-    </w:p>
-    <w:p/>
-    <w:p>
+      <w:pPr>
+        <w:jc w:val="center"/>
+      </w:pPr>
       <w:r>
         <w:drawing>
           <wp:inline xmlns:a="http://schemas.openxmlformats.org/drawingml/2006/main" xmlns:pic="http://schemas.openxmlformats.org/drawingml/2006/picture">
-            <wp:extent cx="5486400" cy="2455489"/>
+            <wp:extent cx="4572000" cy="2237838"/>
             <wp:docPr id="1" name="Picture 1"/>
             <wp:cNvGraphicFramePr>
               <a:graphicFrameLocks noChangeAspect="1"/>
@@ -363,7 +354,7 @@
                   <pic:spPr>
                     <a:xfrm>
                       <a:off x="0" y="0"/>
-                      <a:ext cx="5486400" cy="2455489"/>
+                      <a:ext cx="4572000" cy="2237838"/>
                     </a:xfrm>
                     <a:prstGeom prst="rect"/>
                   </pic:spPr>
@@ -372,6 +363,99 @@
             </a:graphic>
           </wp:inline>
         </w:drawing>
+      </w:r>
+    </w:p>
+    <w:p>
+      <w:pPr>
+        <w:jc w:val="center"/>
+      </w:pPr>
+      <w:r>
+        <w:rPr>
+          <w:i/>
+          <w:sz w:val="16"/>
+        </w:rPr>
+        <w:t>Fig. 7. Comparison of manual vs. AI-assisted workflow preparation (left, log scale) and end-to-end pipeline execution time (right). AI reduces setup from 55 min to 5 sec (275× faster) while HPC compute time remains unchanged.</w:t>
+      </w:r>
+    </w:p>
+    <w:p/>
+    <w:p>
+      <w:r>
+        <w:t>Critically, AI assistance does not reduce HPC computation time—Omega3P and Track3P execute identically regardless of how the workflow was created. The benefit is entirely in the human-effort phases: workflow setup, configuration, and post-processing. For the Track3P multipacting pipeline, the end-to-end wall-clock time drops from ~69 minutes (55 min setup + 4 min compute + 10 min post-processing) to ~5 minutes (5 sec setup + 4 min compute + 2 sec auto-plots), a 93% reduction.</w:t>
+      </w:r>
+    </w:p>
+    <w:p/>
+    <w:p>
+      <w:r>
+        <w:t>Without an agentic assistant, simulation workflow bottlenecks include: (1) workflow authoring errors requiring iterative debugging with Slurm, (2) incorrect resource requests leading to job failures or queue priority loss, (3) manual directory and dependency management across multi-solver pipelines, and (4) delayed post-processing due to manual script writing. The AI-assisted approach eliminates categories (1)–(4) by generating validated, correctly-configured workflows with built-in post-processing from a single natural-language request.</w:t>
+      </w:r>
+    </w:p>
+    <w:p/>
+    <w:p>
+      <w:r>
+        <w:t>——————————————————————————————</w:t>
+      </w:r>
+    </w:p>
+    <w:p/>
+    <w:p>
+      <w:pPr>
+        <w:pStyle w:val="Heading2"/>
+      </w:pPr>
+      <w:r>
+        <w:t>2. Fix in Section VIII (PROTOTYPE WORKFLOW LIFECYCLE)</w:t>
+      </w:r>
+    </w:p>
+    <w:p/>
+    <w:p>
+      <w:r>
+        <w:t>Change the caption from:</w:t>
+      </w:r>
+    </w:p>
+    <w:p>
+      <w:r>
+        <w:rPr>
+          <w:i/>
+        </w:rPr>
+        <w:t xml:space="preserve">    "User-visible lifecycle for an agent-assisted ACE3P workflow."</w:t>
+      </w:r>
+    </w:p>
+    <w:p>
+      <w:r>
+        <w:t>To:</w:t>
+      </w:r>
+    </w:p>
+    <w:p>
+      <w:r>
+        <w:rPr>
+          <w:i/>
+        </w:rPr>
+        <w:t xml:space="preserve">    "Fig. 6. User-visible lifecycle for an agent-assisted ACE3P workflow."</w:t>
+      </w:r>
+    </w:p>
+    <w:p/>
+    <w:p>
+      <w:r>
+        <w:t>And in the first paragraph of Section VIII, change:</w:t>
+      </w:r>
+    </w:p>
+    <w:p>
+      <w:r>
+        <w:rPr>
+          <w:i/>
+        </w:rPr>
+        <w:t xml:space="preserve">    "...this section walks through the intended lifecycle of a representative ACE3P scaling workflow."</w:t>
+      </w:r>
+    </w:p>
+    <w:p>
+      <w:r>
+        <w:t>To:</w:t>
+      </w:r>
+    </w:p>
+    <w:p>
+      <w:r>
+        <w:rPr>
+          <w:i/>
+        </w:rPr>
+        <w:t xml:space="preserve">    "...this section walks through the intended lifecycle of a representative ACE3P scaling workflow, illustrated in Fig. 6."</w:t>
       </w:r>
     </w:p>
     <w:sectPr>

</xml_diff>